<commit_message>
Finalize JQAS survival submission: archive legacy ordinal paper, add internal-hire audit probe, refresh submission docs, untrack build artifacts
</commit_message>
<xml_diff>
--- a/latex/Cover Letter.docx
+++ b/latex/Cover Letter.docx
@@ -13,7 +13,7 @@
         <w:t xml:space="preserve"> 2</w:t>
       </w:r>
       <w:r>
-        <w:t>0</w:t>
+        <w:t>4</w:t>
       </w:r>
       <w:r>
         <w:t>, 2026</w:t>
@@ -72,13 +72,7 @@
         <w:jc w:val="both"/>
       </w:pPr>
       <w:r>
-        <w:t>I am writing to submit my manuscript "</w:t>
-      </w:r>
-      <w:r>
-        <w:t>Predicting NFL Head Coach Tenure Using Ordinal Classification</w:t>
-      </w:r>
-      <w:r>
-        <w:t>" for consideration in the Journal of Quantitative Analysis in Sports.</w:t>
+        <w:t>Please consider the enclosed manuscript, "Predicting NFL Head Coach Dismissal at the Time of Hire: A Firing-Aware Survival Analysis," for publication in the Journal of Quantitative Analysis in Sports as a Research Article.</w:t>
       </w:r>
     </w:p>
     <w:p>
@@ -93,7 +87,25 @@
         <w:jc w:val="both"/>
       </w:pPr>
       <w:r>
-        <w:t>This manuscript introduces a novel application of ordinal classification to predict NFL head coach tenure using only information available at the time of hiring. While prior research has examined isolated factors affecting coaching success, no comprehensive framework exists for predicting tenure outcomes that respects the natural ordering of coaching tenures (short, medium, long). With approximately half of NFL head coaching hires lasting two years or fewer, teams clearly struggle to identify successful candidates through traditional evaluation methods, yet the hiring process remains largely subjective.</w:t>
+        <w:t xml:space="preserve">Head coach turnover in the NFL is frequent and consequential, and the quantitative work on it has consistently traced dismissal to a coach's performance once in the job. </w:t>
+      </w:r>
+      <w:r>
+        <w:t>Past studies’</w:t>
+      </w:r>
+      <w:r>
+        <w:t xml:space="preserve"> recurring conclusion</w:t>
+      </w:r>
+      <w:r>
+        <w:t>s</w:t>
+      </w:r>
+      <w:r>
+        <w:t xml:space="preserve">, that losing leads to firing, </w:t>
+      </w:r>
+      <w:r>
+        <w:t>offer</w:t>
+      </w:r>
+      <w:r>
+        <w:t xml:space="preserve"> little to a team deciding whom to hire in the first place.</w:t>
       </w:r>
     </w:p>
     <w:p>
@@ -108,13 +120,13 @@
         <w:jc w:val="both"/>
       </w:pPr>
       <w:r>
-        <w:t xml:space="preserve">The key methodological innovation is implementing the Frank-Hall binary decomposition method with XGBoost base classifiers, optimized using Quadratic Weighted Kappa rather than standard classification metrics. This ordinal approach achieves </w:t>
-      </w:r>
-      <w:r>
-        <w:t xml:space="preserve">significant </w:t>
-      </w:r>
-      <w:r>
-        <w:t xml:space="preserve">improvement over human baseline decisions. </w:t>
+        <w:t xml:space="preserve">This manuscript poses the </w:t>
+      </w:r>
+      <w:r>
+        <w:t>question</w:t>
+      </w:r>
+      <w:r>
+        <w:t xml:space="preserve">: using only what is observable when the contract is signed, how much of an eventual dismissal is already foreseeable? I recast the problem as a firing-aware, competing-risks survival analysis over 371 modern-era head coaching stints (1970 to 2025), modeling the time from hire to firing entirely from pre-hire information while treating voluntary departures as a competing event and coaches still active at the data boundary as censored. </w:t>
       </w:r>
     </w:p>
     <w:p>
@@ -129,19 +141,43 @@
         <w:jc w:val="both"/>
       </w:pPr>
       <w:r>
-        <w:t xml:space="preserve">I should note that while I am not formally affiliated with an academic institution, I have pursued this research independently as part of a sustained commitment to advancing sports analytics methodology. Two of my research papers have </w:t>
-      </w:r>
-      <w:r>
-        <w:t>advanced to the semifinals of</w:t>
-      </w:r>
-      <w:r>
-        <w:t xml:space="preserve"> the MIT Sloan Sports Analytics Conference</w:t>
-      </w:r>
-      <w:r>
-        <w:t xml:space="preserve"> research paper competition</w:t>
-      </w:r>
-      <w:r>
-        <w:t xml:space="preserve">. </w:t>
+        <w:t xml:space="preserve">The central finding is one of bounded predictability. A cause-specific Cox model, benchmarked against parametric and gradient-boosted alternatives and fit on Cox-native stability-selected features, reaches a Harrell concordance of 0.602 and an integrated Brier score of 0.176. The broad on-field record that hiring searches </w:t>
+      </w:r>
+      <w:r>
+        <w:t xml:space="preserve">appear to </w:t>
+      </w:r>
+      <w:r>
+        <w:t>scrutinize</w:t>
+      </w:r>
+      <w:r>
+        <w:t xml:space="preserve"> (e.g., </w:t>
+      </w:r>
+      <w:r>
+        <w:t>points, yards, and turnovers</w:t>
+      </w:r>
+      <w:r>
+        <w:t>, etc.)</w:t>
+      </w:r>
+      <w:r>
+        <w:t>, forecasts dismissal no better than chance. The one durable pre-hire signal is structural rather than performance-based: internally promoted coaches face a higher firing hazard than external hires</w:t>
+      </w:r>
+      <w:r>
+        <w:t xml:space="preserve">, </w:t>
+      </w:r>
+      <w:r>
+        <w:t xml:space="preserve">with weaker contributions from age at hire and prior-unit efficiency. </w:t>
+      </w:r>
+      <w:r>
+        <w:t>The findings of this paper</w:t>
+      </w:r>
+      <w:r>
+        <w:t xml:space="preserve"> </w:t>
+      </w:r>
+      <w:r>
+        <w:t>bear</w:t>
+      </w:r>
+      <w:r>
+        <w:t xml:space="preserve"> directly on how franchises allocate their evaluation effort and on the broader debate over whether coaching changes accomplish what teams intend.</w:t>
       </w:r>
     </w:p>
     <w:p>
@@ -214,7 +250,7 @@
     </w:p>
     <w:sectPr>
       <w:pgSz w:w="12240" w:h="15840"/>
-      <w:pgMar w:top="1152" w:right="1440" w:bottom="1152" w:left="1440" w:header="720" w:footer="720" w:gutter="0"/>
+      <w:pgMar w:top="1440" w:right="1080" w:bottom="1440" w:left="1080" w:header="720" w:footer="720" w:gutter="0"/>
       <w:cols w:space="720"/>
       <w:docGrid w:linePitch="360"/>
     </w:sectPr>

</xml_diff>